<commit_message>
Mensajes primer contacto: beneficiarios en fundaciones; la frase de respaldo de los correos es la garantia
Co-Authored-By: Claude Fable 5.1 <noreply@anthropic.com>
</commit_message>
<xml_diff>
--- a/recursos/comercial/INDUCCION_COMERCIAL/contratacion comercial/MENSAJES_PRIMER_CONTACTO_EMPRESAS.docx
+++ b/recursos/comercial/INDUCCION_COMERCIAL/contratacion comercial/MENSAJES_PRIMER_CONTACTO_EMPRESAS.docx
@@ -119,7 +119,15 @@
       </w:r>
       <w:proofErr w:type="spellEnd"/>
       <w:r>
-        <w:t xml:space="preserve"> el mismo día.</w:t>
+        <w:t xml:space="preserve"> el </w:t>
+      </w:r>
+      <w:proofErr w:type="spellStart"/>
+      <w:r>
+        <w:t>mismo</w:t>
+      </w:r>
+      <w:proofErr w:type="spellEnd"/>
+      <w:r>
+        <w:t xml:space="preserve"> día.</w:t>
       </w:r>
     </w:p>
     <w:p>
@@ -136,10 +144,6 @@
         </w:rPr>
         <w:t>Se envía desde el correo de la academia, de martes a jueves, dentro del horario legal (7:00 a. m. a 7:00 p. m.). Según los estudios la hora exacta no cambia la respuesta; lo que importa es estar arriba en la bandeja cuando el gerente la abre: si los gerentes leen en la noche, se programa el envío para las 6:30 p. m.; si leen temprano, para las 7:00 a. m. Sin adjuntos ni enlaces. Nunca desde un correo personal ni con copia oculta a varias empresas.</w:t>
       </w:r>
-      <w:proofErr w:type="gramStart"/>
-      <w:proofErr w:type="gramEnd"/>
-      <w:proofErr w:type="spellStart"/>
-      <w:proofErr w:type="spellEnd"/>
     </w:p>
     <w:p>
       <w:pPr>
@@ -227,12 +231,8 @@
               <w:rPr>
                 <w:lang w:val="es-CO"/>
               </w:rPr>
-              <w:t>En Heiiu English Academy abrimos becas con el nombre de [Empresa] para sus colaboradores, sin costo para la empresa: un beneficio que usted le entrega a su gente sin tocar presupuesto, y con el que puede premiar a quien quiere retener. Cada becado estudia con garantía de aprendizaje por escrito.</w:t>
+              <w:t>En Heiiu English Academy abrimos becas con el nombre de [Empresa] para sus colaboradores [en una fundación: para su equipo y sus beneficiarios], sin costo para la empresa: un beneficio que usted le entrega a su gente sin tocar presupuesto, y con el que puede premiar a quien quiere retener. Cada becado estudia con garantía de aprendizaje por escrito.</w:t>
             </w:r>
-            <w:proofErr w:type="spellStart"/>
-            <w:proofErr w:type="spellEnd"/>
-            <w:proofErr w:type="spellStart"/>
-            <w:proofErr w:type="spellEnd"/>
             <w:proofErr w:type="gramEnd"/>
           </w:p>
           <w:p>
@@ -248,7 +248,6 @@
               </w:rPr>
               <w:t xml:space="preserve">¿Le </w:t>
             </w:r>
-            <w:proofErr w:type="spellStart"/>
             <w:r>
               <w:rPr>
                 <w:lang w:val="es-CO"/>
@@ -259,9 +258,8 @@
               <w:rPr>
                 <w:lang w:val="es-CO"/>
               </w:rPr>
-              <w:t>ria</w:t>
+              <w:t>ría</w:t>
             </w:r>
-            <w:proofErr w:type="spellEnd"/>
             <w:r>
               <w:rPr>
                 <w:lang w:val="es-CO"/>
@@ -438,10 +436,6 @@
               </w:rPr>
               <w:t>En Heiiu English Academy abrimos becas con el nombre de [Clínica] para su personal de recepción, enfermería y atención al paciente, sin costo para la clínica: un beneficio para su gente sin tocar presupuesto. Entrenan en situaciones reales de clínica, como atender al paciente que llama o escribe en inglés, con garantía de aprendizaje por escrito.</w:t>
             </w:r>
-            <w:proofErr w:type="spellStart"/>
-            <w:proofErr w:type="spellEnd"/>
-            <w:proofErr w:type="spellStart"/>
-            <w:proofErr w:type="spellEnd"/>
           </w:p>
           <w:p>
             <w:pPr>
@@ -456,7 +450,6 @@
               </w:rPr>
               <w:t xml:space="preserve">¿Le </w:t>
             </w:r>
-            <w:proofErr w:type="spellStart"/>
             <w:r>
               <w:rPr>
                 <w:lang w:val="es-CO"/>
@@ -467,9 +460,8 @@
               <w:rPr>
                 <w:lang w:val="es-CO"/>
               </w:rPr>
-              <w:t>ria</w:t>
+              <w:t>ría</w:t>
             </w:r>
-            <w:proofErr w:type="spellEnd"/>
             <w:r>
               <w:rPr>
                 <w:lang w:val="es-CO"/>
@@ -606,8 +598,6 @@
               </w:rPr>
               <w:t>Si está afiliada: "sus colaboradores afiliados a Cajasan ya tienen la beca más alta de nuestro Fondo por su cuenta; lo que la alianza agrega es para la empresa: tres becas por trimestre con el nombre de [Empresa], que suben a cinco si todos sus becados cumplen, con certificado a su nombre, y la charla en su sede."</w:t>
             </w:r>
-            <w:proofErr w:type="gramStart"/>
-            <w:proofErr w:type="gramEnd"/>
           </w:p>
           <w:p>
             <w:pPr>
@@ -650,7 +640,15 @@
             </w:r>
             <w:proofErr w:type="spellEnd"/>
             <w:r>
-              <w:t xml:space="preserve"> llamada o en su oficina.</w:t>
+              <w:t xml:space="preserve"> </w:t>
+            </w:r>
+            <w:proofErr w:type="spellStart"/>
+            <w:r>
+              <w:t>llamada</w:t>
+            </w:r>
+            <w:proofErr w:type="spellEnd"/>
+            <w:r>
+              <w:t xml:space="preserve"> o en su oficina.</w:t>
             </w:r>
           </w:p>
         </w:tc>
@@ -822,6 +820,9 @@
             <w:r>
               <w:t>interesa</w:t>
             </w:r>
+            <w:r>
+              <w:t>ría</w:t>
+            </w:r>
             <w:proofErr w:type="spellEnd"/>
             <w:r>
               <w:t xml:space="preserve"> </w:t>
@@ -984,12 +985,6 @@
         </w:rPr>
         <w:t>La política de WhatsApp exige que la persona haya dado su número y aceptado recibir mensajes. Sin eso no se escribe. Sí se puede cuando la persona le dio el número antes: un contacto de un trabajo anterior, una reunión, una tarjeta entregada, un referido que autorizó o la línea de atención publicada por la empresa. Se escribe desde el celular del cargo (por ahora, el propio), nunca desde la línea principal de la academia.</w:t>
       </w:r>
-      <w:proofErr w:type="gramStart"/>
-      <w:proofErr w:type="gramEnd"/>
-      <w:proofErr w:type="gramStart"/>
-      <w:proofErr w:type="spellStart"/>
-      <w:proofErr w:type="spellEnd"/>
-      <w:proofErr w:type="gramEnd"/>
     </w:p>
     <w:tbl>
       <w:tblPr>
@@ -1308,8 +1303,17 @@
                 <w:b/>
                 <w:sz w:val="17"/>
               </w:rPr>
-              <w:t>: 15 minutos</w:t>
+              <w:t xml:space="preserve">: 15 </w:t>
             </w:r>
+            <w:proofErr w:type="spellStart"/>
+            <w:r>
+              <w:rPr>
+                <w:b/>
+                <w:sz w:val="17"/>
+              </w:rPr>
+              <w:t>minutos</w:t>
+            </w:r>
+            <w:proofErr w:type="spellEnd"/>
           </w:p>
         </w:tc>
         <w:tc>
@@ -1399,33 +1403,22 @@
             <w:tcW w:w="5783" w:type="dxa"/>
           </w:tcPr>
           <w:p>
+            <w:pPr>
+              <w:rPr>
+                <w:lang w:val="es-CO"/>
+              </w:rPr>
+            </w:pPr>
             <w:r>
               <w:rPr>
                 <w:sz w:val="17"/>
                 <w:lang w:val="es-CO"/>
               </w:rPr>
-              <w:t xml:space="preserve">Licencia desde 2012, ICONTEC o garantía por escrito. </w:t>
+              <w:t>En los correos modelo esa frase es la garantía por escrito ("cada becado estudia con garantía de aprendizaje por escrito"). Licencia desde 2012 e ICONTEC se guardan para la reunión; no se apilan las tres.</w:t>
             </w:r>
-            <w:r>
-              <w:rPr>
-                <w:sz w:val="17"/>
-              </w:rPr>
-              <w:t xml:space="preserve">Una, no las </w:t>
-            </w:r>
+            <w:proofErr w:type="gramStart"/>
             <w:proofErr w:type="spellStart"/>
-            <w:r>
-              <w:rPr>
-                <w:sz w:val="17"/>
-              </w:rPr>
-              <w:t>tres</w:t>
-            </w:r>
             <w:proofErr w:type="spellEnd"/>
-            <w:r>
-              <w:rPr>
-                <w:sz w:val="17"/>
-              </w:rPr>
-              <w:t>.</w:t>
-            </w:r>
+            <w:proofErr w:type="gramEnd"/>
           </w:p>
         </w:tc>
       </w:tr>
@@ -1663,8 +1656,6 @@
         </w:rPr>
         <w:t>Empezar por lo que la empresa tendría que pagar ("la inversión de la organización"). Nosotros decimos primero que la alianza no le cuesta; el plan empresa pagado se ofrece en la reunión, si quiere formar.</w:t>
       </w:r>
-      <w:proofErr w:type="gramStart"/>
-      <w:proofErr w:type="gramEnd"/>
     </w:p>
     <w:p>
       <w:pPr>
@@ -1702,7 +1693,15 @@
       </w:r>
       <w:proofErr w:type="spellEnd"/>
       <w:r>
-        <w:t xml:space="preserve"> etapa.</w:t>
+        <w:t xml:space="preserve"> </w:t>
+      </w:r>
+      <w:proofErr w:type="spellStart"/>
+      <w:r>
+        <w:t>etapa</w:t>
+      </w:r>
+      <w:proofErr w:type="spellEnd"/>
+      <w:r>
+        <w:t>.</w:t>
       </w:r>
     </w:p>
     <w:p>
@@ -1719,8 +1718,6 @@
         </w:rPr>
         <w:t>Más de 100 palabras, párrafos largos, adjuntos, varias peticiones, firma sin cargo completo ni número de celular para que el gerente pueda llamar o escribir.</w:t>
       </w:r>
-      <w:proofErr w:type="gramStart"/>
-      <w:proofErr w:type="gramEnd"/>
     </w:p>
     <w:p>
       <w:pPr>

</xml_diff>